<commit_message>
updated lab1 log book
</commit_message>
<xml_diff>
--- a/labs/lab1/lab1.docx
+++ b/labs/lab1/lab1.docx
@@ -12,7 +12,7 @@
     </w:p>
     <w:p>
       <w:r>
-        <w:t xml:space="preserve">With reference to the provided data sheet max current through a (red) led is </w:t>
+        <w:t xml:space="preserve">With reference to the provided data sheet, the maximum current through a (red) LED is </w:t>
       </w:r>
       <w:r>
         <w:rPr>
@@ -22,7 +22,7 @@
         <w:t>20mA</w:t>
       </w:r>
       <w:r>
-        <w:t xml:space="preserve"> and voltage output from digital pin is </w:t>
+        <w:t xml:space="preserve"> and the voltage output from a digital pin is </w:t>
       </w:r>
       <w:r>
         <w:rPr>
@@ -30,6 +30,13 @@
           <w:bCs/>
         </w:rPr>
         <w:t>5V</w:t>
+      </w:r>
+      <w:r>
+        <w:rPr>
+          <w:b/>
+          <w:bCs/>
+        </w:rPr>
+        <w:t>.</w:t>
       </w:r>
     </w:p>
     <w:p>
@@ -121,19 +128,7 @@
             <w:rPr>
               <w:rFonts w:ascii="Cambria Math" w:eastAsiaTheme="minorEastAsia" w:hAnsi="Cambria Math"/>
             </w:rPr>
-            <m:t>=2</m:t>
-          </m:r>
-          <m:r>
-            <w:rPr>
-              <w:rFonts w:ascii="Cambria Math" w:eastAsiaTheme="minorEastAsia" w:hAnsi="Cambria Math"/>
-            </w:rPr>
-            <m:t>5</m:t>
-          </m:r>
-          <m:r>
-            <w:rPr>
-              <w:rFonts w:ascii="Cambria Math" w:eastAsiaTheme="minorEastAsia" w:hAnsi="Cambria Math"/>
-            </w:rPr>
-            <m:t>0</m:t>
+            <m:t>=250</m:t>
           </m:r>
           <m:r>
             <m:rPr>
@@ -172,7 +167,67 @@
         <w:rPr>
           <w:rFonts w:eastAsiaTheme="minorEastAsia"/>
         </w:rPr>
-        <w:t>In the Arduino Mega, pins are commonly referenced by their numerical values, which correspond to the physical pin numbers on the board. Additionally, the digital pins are organized into distinct regions labeled as ports A to K. Each port consists of 8 pins and can be manipulated using bytes, allowing for efficient control of multiple pins at once.</w:t>
+        <w:t>Pins on the Arduino Mega are often identified by their numerical values, which match the pin numbers on the board. Furthermore, the digital pins are arranged into distinct regions designated as ports A to K. As each port has eight pins and be</w:t>
+      </w:r>
+      <w:r>
+        <w:rPr>
+          <w:rFonts w:eastAsiaTheme="minorEastAsia"/>
+        </w:rPr>
+        <w:t>ing able to</w:t>
+      </w:r>
+      <w:r>
+        <w:rPr>
+          <w:rFonts w:eastAsiaTheme="minorEastAsia"/>
+        </w:rPr>
+        <w:t xml:space="preserve"> adjust with bitwise operations,</w:t>
+      </w:r>
+      <w:r>
+        <w:rPr>
+          <w:rFonts w:eastAsiaTheme="minorEastAsia"/>
+        </w:rPr>
+        <w:t xml:space="preserve"> it</w:t>
+      </w:r>
+      <w:r>
+        <w:rPr>
+          <w:rFonts w:eastAsiaTheme="minorEastAsia"/>
+        </w:rPr>
+        <w:t xml:space="preserve"> allow</w:t>
+      </w:r>
+      <w:r>
+        <w:rPr>
+          <w:rFonts w:eastAsiaTheme="minorEastAsia"/>
+        </w:rPr>
+        <w:t>s</w:t>
+      </w:r>
+      <w:r>
+        <w:rPr>
+          <w:rFonts w:eastAsiaTheme="minorEastAsia"/>
+        </w:rPr>
+        <w:t xml:space="preserve"> </w:t>
+      </w:r>
+      <w:r>
+        <w:rPr>
+          <w:rFonts w:eastAsiaTheme="minorEastAsia"/>
+        </w:rPr>
+        <w:t>for better and</w:t>
+      </w:r>
+      <w:r>
+        <w:rPr>
+          <w:rFonts w:eastAsiaTheme="minorEastAsia"/>
+        </w:rPr>
+        <w:t xml:space="preserve"> effective control </w:t>
+      </w:r>
+      <w:r>
+        <w:rPr>
+          <w:rFonts w:eastAsiaTheme="minorEastAsia"/>
+        </w:rPr>
+        <w:t xml:space="preserve">of </w:t>
+      </w:r>
+      <w:r>
+        <w:rPr>
+          <w:rFonts w:eastAsiaTheme="minorEastAsia"/>
+        </w:rPr>
+        <w:t>several pins at once.</w:t>
       </w:r>
     </w:p>
     <w:p>
@@ -186,7 +241,7 @@
         <w:rPr>
           <w:rFonts w:eastAsiaTheme="minorEastAsia"/>
         </w:rPr>
-        <w:t>The | (bitwise OR) and &amp; (bitwise AND) symbols play a crucial role in performing bitwise operations on these pins. They enable the comparison and manipulation of individual bits within a byte. By comparing each positional bit with the corresponding bit in another byte, these symbols facilitate operations like setting multiple pins to HIGH or LOW simultaneously.</w:t>
+        <w:t>When doing bitwise operations on these pins, the symbols | (bitwise OR) and &amp; (bitwise AND) are essential. They make it possible to compare and work with individual bits within of a byte. These symbols make it easier to do actions like simultaneously setting several pins to HIGH or LOW by comparing each positional bit with its equivalent bit in another byte.</w:t>
       </w:r>
     </w:p>
     <w:p>
@@ -200,7 +255,27 @@
         <w:rPr>
           <w:rFonts w:eastAsiaTheme="minorEastAsia"/>
         </w:rPr>
-        <w:t>Removing these symbols would alter the behavior of pin manipulation. Without bitwise operations, updating the port with a new byte would involve individually setting or clearing each pin, resulting in less efficient code execution. Additionally, the absence of bitwise operations would limit the optimization potential for speed and resource utilization in Arduino sketches.</w:t>
+        <w:t>Removing these symbols would alter the behavior of pin manipulation. Without bitwise operations, updating the port with a new byte would involve individually setting or clearing each pin</w:t>
+      </w:r>
+      <w:r>
+        <w:rPr>
+          <w:rFonts w:eastAsiaTheme="minorEastAsia"/>
+        </w:rPr>
+        <w:t>.</w:t>
+      </w:r>
+    </w:p>
+    <w:p>
+      <w:pPr>
+        <w:spacing w:line="278" w:lineRule="auto"/>
+        <w:rPr>
+          <w:rFonts w:eastAsiaTheme="minorEastAsia"/>
+        </w:rPr>
+      </w:pPr>
+      <w:r>
+        <w:rPr>
+          <w:rFonts w:eastAsiaTheme="minorEastAsia"/>
+        </w:rPr>
+        <w:br w:type="page"/>
       </w:r>
     </w:p>
     <w:p>
@@ -214,13 +289,929 @@
         <w:rPr>
           <w:rFonts w:eastAsiaTheme="minorEastAsia"/>
         </w:rPr>
+        <w:lastRenderedPageBreak/>
         <w:t>Task 3</w:t>
       </w:r>
     </w:p>
-    <w:p/>
+    <w:p>
+      <w:pPr>
+        <w:pStyle w:val="Heading2"/>
+        <w:rPr>
+          <w:rFonts w:asciiTheme="minorHAnsi" w:eastAsiaTheme="minorHAnsi" w:hAnsiTheme="minorHAnsi" w:cstheme="minorBidi"/>
+          <w:color w:val="auto"/>
+          <w:sz w:val="22"/>
+          <w:szCs w:val="22"/>
+        </w:rPr>
+      </w:pPr>
+      <w:r>
+        <w:rPr>
+          <w:rFonts w:asciiTheme="minorHAnsi" w:eastAsiaTheme="minorHAnsi" w:hAnsiTheme="minorHAnsi" w:cstheme="minorBidi"/>
+          <w:color w:val="auto"/>
+          <w:sz w:val="22"/>
+          <w:szCs w:val="22"/>
+        </w:rPr>
+        <w:t xml:space="preserve">In Task 3, the objective is to alternate the lighting of 2 LEDs </w:t>
+      </w:r>
+      <w:r>
+        <w:rPr>
+          <w:rFonts w:asciiTheme="minorHAnsi" w:eastAsiaTheme="minorHAnsi" w:hAnsiTheme="minorHAnsi" w:cstheme="minorBidi"/>
+          <w:color w:val="auto"/>
+          <w:sz w:val="22"/>
+          <w:szCs w:val="22"/>
+        </w:rPr>
+        <w:t>with connection to 2 digital pins of the Arduino board.</w:t>
+      </w:r>
+    </w:p>
+    <w:p>
+      <w:pPr>
+        <w:pStyle w:val="Heading2"/>
+        <w:rPr>
+          <w:rFonts w:asciiTheme="minorHAnsi" w:eastAsiaTheme="minorHAnsi" w:hAnsiTheme="minorHAnsi" w:cstheme="minorBidi"/>
+          <w:color w:val="auto"/>
+          <w:sz w:val="22"/>
+          <w:szCs w:val="22"/>
+        </w:rPr>
+      </w:pPr>
+      <w:r>
+        <w:rPr>
+          <w:rFonts w:asciiTheme="minorHAnsi" w:eastAsiaTheme="minorHAnsi" w:hAnsiTheme="minorHAnsi" w:cstheme="minorBidi"/>
+          <w:color w:val="auto"/>
+          <w:sz w:val="22"/>
+          <w:szCs w:val="22"/>
+        </w:rPr>
+        <w:t xml:space="preserve">To achieve this, </w:t>
+      </w:r>
+      <w:r>
+        <w:rPr>
+          <w:rFonts w:asciiTheme="minorHAnsi" w:eastAsiaTheme="minorHAnsi" w:hAnsiTheme="minorHAnsi" w:cstheme="minorBidi"/>
+          <w:color w:val="auto"/>
+          <w:sz w:val="22"/>
+          <w:szCs w:val="22"/>
+        </w:rPr>
+        <w:t>we connect the 2 LEDs to pin 22 and 23 along with a resistor for each,</w:t>
+      </w:r>
+      <w:r>
+        <w:rPr>
+          <w:rFonts w:asciiTheme="minorHAnsi" w:eastAsiaTheme="minorHAnsi" w:hAnsiTheme="minorHAnsi" w:cstheme="minorBidi"/>
+          <w:color w:val="auto"/>
+          <w:sz w:val="22"/>
+          <w:szCs w:val="22"/>
+        </w:rPr>
+        <w:t xml:space="preserve"> </w:t>
+      </w:r>
+      <w:r>
+        <w:rPr>
+          <w:rFonts w:asciiTheme="minorHAnsi" w:eastAsiaTheme="minorHAnsi" w:hAnsiTheme="minorHAnsi" w:cstheme="minorBidi"/>
+          <w:color w:val="auto"/>
+          <w:sz w:val="22"/>
+          <w:szCs w:val="22"/>
+        </w:rPr>
+        <w:t>these</w:t>
+      </w:r>
+      <w:r>
+        <w:rPr>
+          <w:rFonts w:asciiTheme="minorHAnsi" w:eastAsiaTheme="minorHAnsi" w:hAnsiTheme="minorHAnsi" w:cstheme="minorBidi"/>
+          <w:color w:val="auto"/>
+          <w:sz w:val="22"/>
+          <w:szCs w:val="22"/>
+        </w:rPr>
+        <w:t xml:space="preserve"> are the first two pins of PORTA on the Arduino. PORTA consists of 8 pins represented as 8 bits, the first two LSBs represent pins 22 and 23</w:t>
+      </w:r>
+      <w:r>
+        <w:rPr>
+          <w:rFonts w:asciiTheme="minorHAnsi" w:eastAsiaTheme="minorHAnsi" w:hAnsiTheme="minorHAnsi" w:cstheme="minorBidi"/>
+          <w:color w:val="auto"/>
+          <w:sz w:val="22"/>
+          <w:szCs w:val="22"/>
+        </w:rPr>
+        <w:t>.  W</w:t>
+      </w:r>
+      <w:r>
+        <w:rPr>
+          <w:rFonts w:asciiTheme="minorHAnsi" w:eastAsiaTheme="minorHAnsi" w:hAnsiTheme="minorHAnsi" w:cstheme="minorBidi"/>
+          <w:color w:val="auto"/>
+          <w:sz w:val="22"/>
+          <w:szCs w:val="22"/>
+        </w:rPr>
+        <w:t>e program the Arduino to set pin 22 HIGH (represented as binary 0b00000001 = 1) and then after a delay, set pin 23 HIGH (represented as binary 0b00000010 = 2).</w:t>
+      </w:r>
+    </w:p>
+    <w:p>
+      <w:pPr>
+        <w:pStyle w:val="Heading2"/>
+        <w:rPr>
+          <w:rFonts w:asciiTheme="minorHAnsi" w:eastAsiaTheme="minorHAnsi" w:hAnsiTheme="minorHAnsi" w:cstheme="minorBidi"/>
+          <w:color w:val="auto"/>
+          <w:sz w:val="22"/>
+          <w:szCs w:val="22"/>
+        </w:rPr>
+      </w:pPr>
+      <w:r>
+        <w:rPr>
+          <w:rFonts w:asciiTheme="minorHAnsi" w:eastAsiaTheme="minorHAnsi" w:hAnsiTheme="minorHAnsi" w:cstheme="minorBidi"/>
+          <w:color w:val="auto"/>
+          <w:sz w:val="22"/>
+          <w:szCs w:val="22"/>
+        </w:rPr>
+        <w:t>This approach ensures that the LEDs connected to pins 22 and 23 alternate their states, creating an alternating lighting effect.</w:t>
+      </w:r>
+    </w:p>
+    <w:p>
+      <w:pPr>
+        <w:pStyle w:val="Heading2"/>
+      </w:pPr>
+      <w:r>
+        <w:t>Circuit Diagram</w:t>
+      </w:r>
+    </w:p>
+    <w:p>
+      <w:pPr>
+        <w:keepNext/>
+        <w:jc w:val="center"/>
+      </w:pPr>
+      <w:r>
+        <w:rPr>
+          <w:noProof/>
+        </w:rPr>
+        <w:drawing>
+          <wp:inline distT="0" distB="0" distL="0" distR="0" wp14:anchorId="7846C30B" wp14:editId="55F441C6">
+            <wp:extent cx="6397625" cy="3909659"/>
+            <wp:effectExtent l="0" t="0" r="3175" b="0"/>
+            <wp:docPr id="1822762012" name="Picture 1" descr="A circuit board with wires&#10;&#10;Description automatically generated"/>
+            <wp:cNvGraphicFramePr>
+              <a:graphicFrameLocks xmlns:a="http://schemas.openxmlformats.org/drawingml/2006/main" noChangeAspect="1"/>
+            </wp:cNvGraphicFramePr>
+            <a:graphic xmlns:a="http://schemas.openxmlformats.org/drawingml/2006/main">
+              <a:graphicData uri="http://schemas.openxmlformats.org/drawingml/2006/picture">
+                <pic:pic xmlns:pic="http://schemas.openxmlformats.org/drawingml/2006/picture">
+                  <pic:nvPicPr>
+                    <pic:cNvPr id="1822762012" name="Picture 1" descr="A circuit board with wires&#10;&#10;Description automatically generated"/>
+                    <pic:cNvPicPr/>
+                  </pic:nvPicPr>
+                  <pic:blipFill>
+                    <a:blip r:embed="rId5">
+                      <a:extLst>
+                        <a:ext uri="{28A0092B-C50C-407E-A947-70E740481C1C}">
+                          <a14:useLocalDpi xmlns:a14="http://schemas.microsoft.com/office/drawing/2010/main" val="0"/>
+                        </a:ext>
+                      </a:extLst>
+                    </a:blip>
+                    <a:stretch>
+                      <a:fillRect/>
+                    </a:stretch>
+                  </pic:blipFill>
+                  <pic:spPr>
+                    <a:xfrm>
+                      <a:off x="0" y="0"/>
+                      <a:ext cx="6431181" cy="3930165"/>
+                    </a:xfrm>
+                    <a:prstGeom prst="rect">
+                      <a:avLst/>
+                    </a:prstGeom>
+                  </pic:spPr>
+                </pic:pic>
+              </a:graphicData>
+            </a:graphic>
+          </wp:inline>
+        </w:drawing>
+      </w:r>
+    </w:p>
+    <w:p>
+      <w:pPr>
+        <w:pStyle w:val="Caption"/>
+        <w:jc w:val="center"/>
+      </w:pPr>
+      <w:r>
+        <w:t xml:space="preserve">Figure </w:t>
+      </w:r>
+      <w:r>
+        <w:fldChar w:fldCharType="begin"/>
+      </w:r>
+      <w:r>
+        <w:instrText xml:space="preserve"> SEQ Figure \* ARABIC </w:instrText>
+      </w:r>
+      <w:r>
+        <w:fldChar w:fldCharType="separate"/>
+      </w:r>
+      <w:r>
+        <w:rPr>
+          <w:noProof/>
+        </w:rPr>
+        <w:t>1</w:t>
+      </w:r>
+      <w:r>
+        <w:fldChar w:fldCharType="end"/>
+      </w:r>
+      <w:r>
+        <w:t xml:space="preserve">- Lab1 task 3 circuit </w:t>
+      </w:r>
+      <w:proofErr w:type="gramStart"/>
+      <w:r>
+        <w:t>diagram</w:t>
+      </w:r>
+      <w:proofErr w:type="gramEnd"/>
+    </w:p>
+    <w:p>
+      <w:pPr>
+        <w:spacing w:line="278" w:lineRule="auto"/>
+        <w:rPr>
+          <w:rFonts w:asciiTheme="majorHAnsi" w:eastAsiaTheme="majorEastAsia" w:hAnsiTheme="majorHAnsi" w:cstheme="majorBidi"/>
+          <w:color w:val="0F4761" w:themeColor="accent1" w:themeShade="BF"/>
+          <w:sz w:val="32"/>
+          <w:szCs w:val="32"/>
+        </w:rPr>
+      </w:pPr>
+      <w:r>
+        <w:br w:type="page"/>
+      </w:r>
+    </w:p>
+    <w:p>
+      <w:pPr>
+        <w:pStyle w:val="Heading2"/>
+      </w:pPr>
+      <w:r>
+        <w:lastRenderedPageBreak/>
+        <w:t>Code Snippet</w:t>
+      </w:r>
+    </w:p>
+    <w:bookmarkStart w:id="0" w:name="_MON_1770743339"/>
+    <w:bookmarkEnd w:id="0"/>
+    <w:p>
+      <w:pPr>
+        <w:jc w:val="center"/>
+      </w:pPr>
+      <w:r>
+        <w:object w:dxaOrig="9360" w:dyaOrig="6737" w14:anchorId="1FFD3DED">
+          <v:shapetype id="_x0000_t75" coordsize="21600,21600" o:spt="75" o:preferrelative="t" path="m@4@5l@4@11@9@11@9@5xe" filled="f" stroked="f">
+            <v:stroke joinstyle="miter"/>
+            <v:formulas>
+              <v:f eqn="if lineDrawn pixelLineWidth 0"/>
+              <v:f eqn="sum @0 1 0"/>
+              <v:f eqn="sum 0 0 @1"/>
+              <v:f eqn="prod @2 1 2"/>
+              <v:f eqn="prod @3 21600 pixelWidth"/>
+              <v:f eqn="prod @3 21600 pixelHeight"/>
+              <v:f eqn="sum @0 0 1"/>
+              <v:f eqn="prod @6 1 2"/>
+              <v:f eqn="prod @7 21600 pixelWidth"/>
+              <v:f eqn="sum @8 21600 0"/>
+              <v:f eqn="prod @7 21600 pixelHeight"/>
+              <v:f eqn="sum @10 21600 0"/>
+            </v:formulas>
+            <v:path o:extrusionok="f" gradientshapeok="t" o:connecttype="rect"/>
+            <o:lock v:ext="edit" aspectratio="t"/>
+          </v:shapetype>
+          <v:shape id="_x0000_i1025" type="#_x0000_t75" style="width:468pt;height:321pt" o:ole="">
+            <v:imagedata r:id="rId6" o:title=""/>
+          </v:shape>
+          <o:OLEObject Type="Embed" ProgID="Word.OpenDocumentText.12" ShapeID="_x0000_i1025" DrawAspect="Content" ObjectID="_1770751621" r:id="rId7"/>
+        </w:object>
+      </w:r>
+    </w:p>
+    <w:p>
+      <w:pPr>
+        <w:pStyle w:val="Heading2"/>
+      </w:pPr>
+      <w:r>
+        <w:t>Program Logic</w:t>
+      </w:r>
+    </w:p>
+    <w:p>
+      <w:pPr>
+        <w:keepNext/>
+        <w:jc w:val="center"/>
+      </w:pPr>
+      <w:r>
+        <w:rPr>
+          <w:noProof/>
+        </w:rPr>
+        <w:drawing>
+          <wp:inline distT="0" distB="0" distL="0" distR="0" wp14:anchorId="67FB218C" wp14:editId="6848500E">
+            <wp:extent cx="3581400" cy="3677937"/>
+            <wp:effectExtent l="0" t="0" r="0" b="0"/>
+            <wp:docPr id="1622724098" name="Picture 3" descr="A screenshot of a computer&#10;&#10;Description automatically generated"/>
+            <wp:cNvGraphicFramePr>
+              <a:graphicFrameLocks xmlns:a="http://schemas.openxmlformats.org/drawingml/2006/main" noChangeAspect="1"/>
+            </wp:cNvGraphicFramePr>
+            <a:graphic xmlns:a="http://schemas.openxmlformats.org/drawingml/2006/main">
+              <a:graphicData uri="http://schemas.openxmlformats.org/drawingml/2006/picture">
+                <pic:pic xmlns:pic="http://schemas.openxmlformats.org/drawingml/2006/picture">
+                  <pic:nvPicPr>
+                    <pic:cNvPr id="1622724098" name="Picture 3" descr="A screenshot of a computer&#10;&#10;Description automatically generated"/>
+                    <pic:cNvPicPr/>
+                  </pic:nvPicPr>
+                  <pic:blipFill>
+                    <a:blip r:embed="rId8">
+                      <a:extLst>
+                        <a:ext uri="{28A0092B-C50C-407E-A947-70E740481C1C}">
+                          <a14:useLocalDpi xmlns:a14="http://schemas.microsoft.com/office/drawing/2010/main" val="0"/>
+                        </a:ext>
+                      </a:extLst>
+                    </a:blip>
+                    <a:stretch>
+                      <a:fillRect/>
+                    </a:stretch>
+                  </pic:blipFill>
+                  <pic:spPr>
+                    <a:xfrm>
+                      <a:off x="0" y="0"/>
+                      <a:ext cx="3581400" cy="3677937"/>
+                    </a:xfrm>
+                    <a:prstGeom prst="rect">
+                      <a:avLst/>
+                    </a:prstGeom>
+                  </pic:spPr>
+                </pic:pic>
+              </a:graphicData>
+            </a:graphic>
+          </wp:inline>
+        </w:drawing>
+      </w:r>
+    </w:p>
+    <w:p>
+      <w:pPr>
+        <w:pStyle w:val="Caption"/>
+        <w:jc w:val="center"/>
+      </w:pPr>
+      <w:r>
+        <w:t xml:space="preserve">Figure </w:t>
+      </w:r>
+      <w:r>
+        <w:fldChar w:fldCharType="begin"/>
+      </w:r>
+      <w:r>
+        <w:instrText xml:space="preserve"> SEQ Figure \* ARABIC </w:instrText>
+      </w:r>
+      <w:r>
+        <w:fldChar w:fldCharType="separate"/>
+      </w:r>
+      <w:r>
+        <w:rPr>
+          <w:noProof/>
+        </w:rPr>
+        <w:t>2</w:t>
+      </w:r>
+      <w:r>
+        <w:fldChar w:fldCharType="end"/>
+      </w:r>
+      <w:r>
+        <w:t xml:space="preserve">- Lab1 task 3 </w:t>
+      </w:r>
+      <w:r>
+        <w:t xml:space="preserve">flow </w:t>
+      </w:r>
+      <w:proofErr w:type="gramStart"/>
+      <w:r>
+        <w:t>chart</w:t>
+      </w:r>
+      <w:proofErr w:type="gramEnd"/>
+    </w:p>
+    <w:p>
+      <w:pPr>
+        <w:pStyle w:val="Heading1"/>
+      </w:pPr>
+      <w:r>
+        <w:br w:type="page"/>
+      </w:r>
+      <w:r>
+        <w:lastRenderedPageBreak/>
+        <w:t>Task 4</w:t>
+      </w:r>
+    </w:p>
+    <w:p>
+      <w:r>
+        <w:t xml:space="preserve">In Task </w:t>
+      </w:r>
+      <w:r>
+        <w:t>4</w:t>
+      </w:r>
+      <w:r>
+        <w:t>, the objective is to sequence the lighting of 8 LEDs connected to 8 digital pins of the Arduino board.</w:t>
+      </w:r>
+    </w:p>
+    <w:p>
+      <w:r>
+        <w:t>To achieve this, we connect the 8 LEDs to all the pins of PORTA, along with a resistor for each LED. Each LED will correspond to a specific bit in PORTA's 8-bit binary representation.</w:t>
+      </w:r>
+    </w:p>
+    <w:p>
+      <w:r>
+        <w:t>To light each LED individually at a given time, we set the corresponding bit of PORTA to 1 while keeping the remaining bits at 0. This means that we will iterate through the bits of PORTA from 0b00000001 to 0b10000000, shifting the initial bit to the left for each iteration.</w:t>
+      </w:r>
+    </w:p>
+    <w:p>
+      <w:r>
+        <w:t>This approach ensures that the LEDs connected to pins 22 to 29 sequentially alternate their states, creating a sequential lighting effect.</w:t>
+      </w:r>
+    </w:p>
+    <w:p>
+      <w:pPr>
+        <w:pStyle w:val="Heading2"/>
+      </w:pPr>
+      <w:r>
+        <w:t>Circuit Diagram</w:t>
+      </w:r>
+    </w:p>
+    <w:p>
+      <w:pPr>
+        <w:keepNext/>
+        <w:jc w:val="center"/>
+      </w:pPr>
+      <w:r>
+        <w:rPr>
+          <w:noProof/>
+        </w:rPr>
+        <w:drawing>
+          <wp:inline distT="0" distB="0" distL="0" distR="0" wp14:anchorId="4D358816" wp14:editId="7114E044">
+            <wp:extent cx="6858000" cy="4191000"/>
+            <wp:effectExtent l="0" t="0" r="0" b="0"/>
+            <wp:docPr id="928988056" name="Picture 4"/>
+            <wp:cNvGraphicFramePr>
+              <a:graphicFrameLocks xmlns:a="http://schemas.openxmlformats.org/drawingml/2006/main" noChangeAspect="1"/>
+            </wp:cNvGraphicFramePr>
+            <a:graphic xmlns:a="http://schemas.openxmlformats.org/drawingml/2006/main">
+              <a:graphicData uri="http://schemas.openxmlformats.org/drawingml/2006/picture">
+                <pic:pic xmlns:pic="http://schemas.openxmlformats.org/drawingml/2006/picture">
+                  <pic:nvPicPr>
+                    <pic:cNvPr id="928988056" name="Picture 928988056"/>
+                    <pic:cNvPicPr/>
+                  </pic:nvPicPr>
+                  <pic:blipFill>
+                    <a:blip r:embed="rId9">
+                      <a:extLst>
+                        <a:ext uri="{28A0092B-C50C-407E-A947-70E740481C1C}">
+                          <a14:useLocalDpi xmlns:a14="http://schemas.microsoft.com/office/drawing/2010/main" val="0"/>
+                        </a:ext>
+                      </a:extLst>
+                    </a:blip>
+                    <a:stretch>
+                      <a:fillRect/>
+                    </a:stretch>
+                  </pic:blipFill>
+                  <pic:spPr>
+                    <a:xfrm>
+                      <a:off x="0" y="0"/>
+                      <a:ext cx="6858000" cy="4191000"/>
+                    </a:xfrm>
+                    <a:prstGeom prst="rect">
+                      <a:avLst/>
+                    </a:prstGeom>
+                  </pic:spPr>
+                </pic:pic>
+              </a:graphicData>
+            </a:graphic>
+          </wp:inline>
+        </w:drawing>
+      </w:r>
+    </w:p>
+    <w:p>
+      <w:pPr>
+        <w:pStyle w:val="Caption"/>
+        <w:jc w:val="center"/>
+      </w:pPr>
+      <w:r>
+        <w:t xml:space="preserve">Figure </w:t>
+      </w:r>
+      <w:r>
+        <w:fldChar w:fldCharType="begin"/>
+      </w:r>
+      <w:r>
+        <w:instrText xml:space="preserve"> SEQ Figure \* ARABIC </w:instrText>
+      </w:r>
+      <w:r>
+        <w:fldChar w:fldCharType="separate"/>
+      </w:r>
+      <w:r>
+        <w:rPr>
+          <w:noProof/>
+        </w:rPr>
+        <w:t>3</w:t>
+      </w:r>
+      <w:r>
+        <w:fldChar w:fldCharType="end"/>
+      </w:r>
+      <w:r>
+        <w:t xml:space="preserve">- Lab1 task </w:t>
+      </w:r>
+      <w:r>
+        <w:t>4</w:t>
+      </w:r>
+      <w:r>
+        <w:t xml:space="preserve"> circuit </w:t>
+      </w:r>
+      <w:proofErr w:type="gramStart"/>
+      <w:r>
+        <w:t>diagra</w:t>
+      </w:r>
+      <w:r>
+        <w:t>m</w:t>
+      </w:r>
+      <w:proofErr w:type="gramEnd"/>
+    </w:p>
+    <w:p>
+      <w:pPr>
+        <w:spacing w:line="278" w:lineRule="auto"/>
+      </w:pPr>
+      <w:r>
+        <w:br w:type="page"/>
+      </w:r>
+    </w:p>
+    <w:p>
+      <w:pPr>
+        <w:pStyle w:val="Heading2"/>
+      </w:pPr>
+      <w:r>
+        <w:lastRenderedPageBreak/>
+        <w:t>Code Snippet</w:t>
+      </w:r>
+    </w:p>
+    <w:bookmarkStart w:id="1" w:name="_MON_1770747754"/>
+    <w:bookmarkEnd w:id="1"/>
+    <w:p>
+      <w:pPr>
+        <w:jc w:val="center"/>
+      </w:pPr>
+      <w:r>
+        <w:object w:dxaOrig="9360" w:dyaOrig="6452" w14:anchorId="7CC16785">
+          <v:shape id="_x0000_i1026" type="#_x0000_t75" style="width:468pt;height:322.5pt" o:ole="">
+            <v:imagedata r:id="rId10" o:title=""/>
+          </v:shape>
+          <o:OLEObject Type="Embed" ProgID="Word.OpenDocumentText.12" ShapeID="_x0000_i1026" DrawAspect="Content" ObjectID="_1770751622" r:id="rId11"/>
+        </w:object>
+      </w:r>
+    </w:p>
+    <w:p>
+      <w:pPr>
+        <w:pStyle w:val="Heading2"/>
+      </w:pPr>
+      <w:r>
+        <w:lastRenderedPageBreak/>
+        <w:t>Program Logic</w:t>
+      </w:r>
+    </w:p>
+    <w:p>
+      <w:pPr>
+        <w:keepNext/>
+        <w:jc w:val="center"/>
+      </w:pPr>
+      <w:r>
+        <w:rPr>
+          <w:noProof/>
+        </w:rPr>
+        <w:drawing>
+          <wp:inline distT="0" distB="0" distL="0" distR="0" wp14:anchorId="4375B4FF" wp14:editId="64A64713">
+            <wp:extent cx="4838700" cy="5915025"/>
+            <wp:effectExtent l="0" t="0" r="0" b="9525"/>
+            <wp:docPr id="461197897" name="Picture 5"/>
+            <wp:cNvGraphicFramePr>
+              <a:graphicFrameLocks xmlns:a="http://schemas.openxmlformats.org/drawingml/2006/main" noChangeAspect="1"/>
+            </wp:cNvGraphicFramePr>
+            <a:graphic xmlns:a="http://schemas.openxmlformats.org/drawingml/2006/main">
+              <a:graphicData uri="http://schemas.openxmlformats.org/drawingml/2006/picture">
+                <pic:pic xmlns:pic="http://schemas.openxmlformats.org/drawingml/2006/picture">
+                  <pic:nvPicPr>
+                    <pic:cNvPr id="461197897" name="Picture 461197897"/>
+                    <pic:cNvPicPr/>
+                  </pic:nvPicPr>
+                  <pic:blipFill>
+                    <a:blip r:embed="rId12">
+                      <a:extLst>
+                        <a:ext uri="{28A0092B-C50C-407E-A947-70E740481C1C}">
+                          <a14:useLocalDpi xmlns:a14="http://schemas.microsoft.com/office/drawing/2010/main" val="0"/>
+                        </a:ext>
+                      </a:extLst>
+                    </a:blip>
+                    <a:stretch>
+                      <a:fillRect/>
+                    </a:stretch>
+                  </pic:blipFill>
+                  <pic:spPr>
+                    <a:xfrm>
+                      <a:off x="0" y="0"/>
+                      <a:ext cx="4838700" cy="5915025"/>
+                    </a:xfrm>
+                    <a:prstGeom prst="rect">
+                      <a:avLst/>
+                    </a:prstGeom>
+                  </pic:spPr>
+                </pic:pic>
+              </a:graphicData>
+            </a:graphic>
+          </wp:inline>
+        </w:drawing>
+      </w:r>
+    </w:p>
+    <w:p>
+      <w:pPr>
+        <w:pStyle w:val="Caption"/>
+        <w:jc w:val="center"/>
+      </w:pPr>
+      <w:r>
+        <w:t xml:space="preserve">Figure </w:t>
+      </w:r>
+      <w:r>
+        <w:fldChar w:fldCharType="begin"/>
+      </w:r>
+      <w:r>
+        <w:instrText xml:space="preserve"> SEQ Figure \* ARABIC </w:instrText>
+      </w:r>
+      <w:r>
+        <w:fldChar w:fldCharType="separate"/>
+      </w:r>
+      <w:r>
+        <w:rPr>
+          <w:noProof/>
+        </w:rPr>
+        <w:t>4</w:t>
+      </w:r>
+      <w:r>
+        <w:fldChar w:fldCharType="end"/>
+      </w:r>
+      <w:r>
+        <w:t xml:space="preserve">- Lab1 task </w:t>
+      </w:r>
+      <w:r>
+        <w:t>4</w:t>
+      </w:r>
+      <w:r>
+        <w:t xml:space="preserve"> flow </w:t>
+      </w:r>
+      <w:proofErr w:type="gramStart"/>
+      <w:r>
+        <w:t>chart</w:t>
+      </w:r>
+      <w:proofErr w:type="gramEnd"/>
+    </w:p>
+    <w:p>
+      <w:pPr>
+        <w:spacing w:line="278" w:lineRule="auto"/>
+      </w:pPr>
+      <w:r>
+        <w:br w:type="page"/>
+      </w:r>
+    </w:p>
+    <w:p>
+      <w:pPr>
+        <w:pStyle w:val="Heading1"/>
+      </w:pPr>
+      <w:r>
+        <w:lastRenderedPageBreak/>
+        <w:t>Task 5</w:t>
+      </w:r>
+    </w:p>
+    <w:p>
+      <w:r>
+        <w:t>In Task 5, the objective is to sequence the lighting of 8 LEDs connected to 8 digital pins of the Arduino board other than the pins used in Task 4.</w:t>
+      </w:r>
+    </w:p>
+    <w:p>
+      <w:r>
+        <w:t>To achieve this, we connect the 8 LEDs to all the pins of PORTC, along with a resistor for each LED. Each LED will correspond to a specific bit in PORTA's 8-bit binary representation.</w:t>
+      </w:r>
+    </w:p>
+    <w:p>
+      <w:r>
+        <w:t>To light each LED individually at a given time, we set the corresponding bit of PORTC to 1 while keeping the remaining bits at 0. This means that we will iterate through the bits of PORTC from 0b00000001 to 0b10000000, shifting the initial bit to the left for each iteration.</w:t>
+      </w:r>
+    </w:p>
+    <w:p>
+      <w:r>
+        <w:t>This approach ensures that the LEDs connected to pins 30 to 37 sequentially alternate their states, creating a sequential lighting effect.</w:t>
+      </w:r>
+    </w:p>
+    <w:p>
+      <w:pPr>
+        <w:pStyle w:val="Heading2"/>
+      </w:pPr>
+      <w:r>
+        <w:t>Circuit Diagram</w:t>
+      </w:r>
+    </w:p>
+    <w:p>
+      <w:pPr>
+        <w:keepNext/>
+        <w:jc w:val="center"/>
+      </w:pPr>
+      <w:r>
+        <w:rPr>
+          <w:noProof/>
+        </w:rPr>
+        <w:drawing>
+          <wp:inline distT="0" distB="0" distL="0" distR="0" wp14:anchorId="1D48783A" wp14:editId="2759C038">
+            <wp:extent cx="6858000" cy="4381500"/>
+            <wp:effectExtent l="0" t="0" r="0" b="0"/>
+            <wp:docPr id="951312771" name="Picture 7"/>
+            <wp:cNvGraphicFramePr>
+              <a:graphicFrameLocks xmlns:a="http://schemas.openxmlformats.org/drawingml/2006/main" noChangeAspect="1"/>
+            </wp:cNvGraphicFramePr>
+            <a:graphic xmlns:a="http://schemas.openxmlformats.org/drawingml/2006/main">
+              <a:graphicData uri="http://schemas.openxmlformats.org/drawingml/2006/picture">
+                <pic:pic xmlns:pic="http://schemas.openxmlformats.org/drawingml/2006/picture">
+                  <pic:nvPicPr>
+                    <pic:cNvPr id="951312771" name="Picture 951312771"/>
+                    <pic:cNvPicPr/>
+                  </pic:nvPicPr>
+                  <pic:blipFill>
+                    <a:blip r:embed="rId13">
+                      <a:extLst>
+                        <a:ext uri="{28A0092B-C50C-407E-A947-70E740481C1C}">
+                          <a14:useLocalDpi xmlns:a14="http://schemas.microsoft.com/office/drawing/2010/main" val="0"/>
+                        </a:ext>
+                      </a:extLst>
+                    </a:blip>
+                    <a:stretch>
+                      <a:fillRect/>
+                    </a:stretch>
+                  </pic:blipFill>
+                  <pic:spPr>
+                    <a:xfrm>
+                      <a:off x="0" y="0"/>
+                      <a:ext cx="6858000" cy="4381500"/>
+                    </a:xfrm>
+                    <a:prstGeom prst="rect">
+                      <a:avLst/>
+                    </a:prstGeom>
+                  </pic:spPr>
+                </pic:pic>
+              </a:graphicData>
+            </a:graphic>
+          </wp:inline>
+        </w:drawing>
+      </w:r>
+    </w:p>
+    <w:p>
+      <w:pPr>
+        <w:pStyle w:val="Caption"/>
+        <w:jc w:val="center"/>
+      </w:pPr>
+      <w:r>
+        <w:t xml:space="preserve">Figure </w:t>
+      </w:r>
+      <w:r>
+        <w:fldChar w:fldCharType="begin"/>
+      </w:r>
+      <w:r>
+        <w:instrText xml:space="preserve"> SEQ Figure \* ARABIC </w:instrText>
+      </w:r>
+      <w:r>
+        <w:fldChar w:fldCharType="separate"/>
+      </w:r>
+      <w:r>
+        <w:rPr>
+          <w:noProof/>
+        </w:rPr>
+        <w:t>5</w:t>
+      </w:r>
+      <w:r>
+        <w:fldChar w:fldCharType="end"/>
+      </w:r>
+      <w:r>
+        <w:t xml:space="preserve">- </w:t>
+      </w:r>
+      <w:r>
+        <w:t xml:space="preserve">Lab1 task </w:t>
+      </w:r>
+      <w:r>
+        <w:t>5</w:t>
+      </w:r>
+      <w:r>
+        <w:t xml:space="preserve"> circuit </w:t>
+      </w:r>
+      <w:proofErr w:type="gramStart"/>
+      <w:r>
+        <w:t>diagram</w:t>
+      </w:r>
+      <w:proofErr w:type="gramEnd"/>
+    </w:p>
+    <w:p>
+      <w:pPr>
+        <w:pStyle w:val="Heading2"/>
+      </w:pPr>
+      <w:r>
+        <w:lastRenderedPageBreak/>
+        <w:t>Code Snippet</w:t>
+      </w:r>
+    </w:p>
+    <w:bookmarkStart w:id="2" w:name="_MON_1770749454"/>
+    <w:bookmarkEnd w:id="2"/>
+    <w:p>
+      <w:pPr>
+        <w:jc w:val="center"/>
+      </w:pPr>
+      <w:r>
+        <w:object w:dxaOrig="9360" w:dyaOrig="6452" w14:anchorId="6B5DD293">
+          <v:shape id="_x0000_i1027" type="#_x0000_t75" style="width:468pt;height:322.5pt" o:ole="">
+            <v:imagedata r:id="rId14" o:title=""/>
+          </v:shape>
+          <o:OLEObject Type="Embed" ProgID="Word.OpenDocumentText.12" ShapeID="_x0000_i1027" DrawAspect="Content" ObjectID="_1770751623" r:id="rId15"/>
+        </w:object>
+      </w:r>
+    </w:p>
+    <w:p>
+      <w:pPr>
+        <w:pStyle w:val="Heading2"/>
+      </w:pPr>
+      <w:r>
+        <w:lastRenderedPageBreak/>
+        <w:t>Programming Logic</w:t>
+      </w:r>
+    </w:p>
+    <w:p>
+      <w:pPr>
+        <w:keepNext/>
+        <w:jc w:val="center"/>
+      </w:pPr>
+      <w:r>
+        <w:rPr>
+          <w:noProof/>
+        </w:rPr>
+        <w:drawing>
+          <wp:inline distT="0" distB="0" distL="0" distR="0" wp14:anchorId="73D1C331" wp14:editId="2BDEBB33">
+            <wp:extent cx="4838700" cy="5915025"/>
+            <wp:effectExtent l="0" t="0" r="0" b="9525"/>
+            <wp:docPr id="2038087780" name="Picture 6" descr="A screenshot of a computer&#10;&#10;Description automatically generated"/>
+            <wp:cNvGraphicFramePr>
+              <a:graphicFrameLocks xmlns:a="http://schemas.openxmlformats.org/drawingml/2006/main" noChangeAspect="1"/>
+            </wp:cNvGraphicFramePr>
+            <a:graphic xmlns:a="http://schemas.openxmlformats.org/drawingml/2006/main">
+              <a:graphicData uri="http://schemas.openxmlformats.org/drawingml/2006/picture">
+                <pic:pic xmlns:pic="http://schemas.openxmlformats.org/drawingml/2006/picture">
+                  <pic:nvPicPr>
+                    <pic:cNvPr id="2038087780" name="Picture 6" descr="A screenshot of a computer&#10;&#10;Description automatically generated"/>
+                    <pic:cNvPicPr/>
+                  </pic:nvPicPr>
+                  <pic:blipFill>
+                    <a:blip r:embed="rId16">
+                      <a:extLst>
+                        <a:ext uri="{28A0092B-C50C-407E-A947-70E740481C1C}">
+                          <a14:useLocalDpi xmlns:a14="http://schemas.microsoft.com/office/drawing/2010/main" val="0"/>
+                        </a:ext>
+                      </a:extLst>
+                    </a:blip>
+                    <a:stretch>
+                      <a:fillRect/>
+                    </a:stretch>
+                  </pic:blipFill>
+                  <pic:spPr>
+                    <a:xfrm>
+                      <a:off x="0" y="0"/>
+                      <a:ext cx="4838700" cy="5915025"/>
+                    </a:xfrm>
+                    <a:prstGeom prst="rect">
+                      <a:avLst/>
+                    </a:prstGeom>
+                  </pic:spPr>
+                </pic:pic>
+              </a:graphicData>
+            </a:graphic>
+          </wp:inline>
+        </w:drawing>
+      </w:r>
+    </w:p>
+    <w:p>
+      <w:pPr>
+        <w:pStyle w:val="Caption"/>
+        <w:jc w:val="center"/>
+      </w:pPr>
+      <w:r>
+        <w:t xml:space="preserve">Figure </w:t>
+      </w:r>
+      <w:r>
+        <w:fldChar w:fldCharType="begin"/>
+      </w:r>
+      <w:r>
+        <w:instrText xml:space="preserve"> SEQ Figure \* ARABIC </w:instrText>
+      </w:r>
+      <w:r>
+        <w:fldChar w:fldCharType="separate"/>
+      </w:r>
+      <w:r>
+        <w:rPr>
+          <w:noProof/>
+        </w:rPr>
+        <w:t>6</w:t>
+      </w:r>
+      <w:r>
+        <w:fldChar w:fldCharType="end"/>
+      </w:r>
+      <w:r>
+        <w:t xml:space="preserve">- Lab1 task </w:t>
+      </w:r>
+      <w:r>
+        <w:t>5</w:t>
+      </w:r>
+      <w:r>
+        <w:t xml:space="preserve"> flow </w:t>
+      </w:r>
+      <w:proofErr w:type="gramStart"/>
+      <w:r>
+        <w:t>chart</w:t>
+      </w:r>
+      <w:proofErr w:type="gramEnd"/>
+    </w:p>
     <w:sectPr>
       <w:pgSz w:w="12240" w:h="15840"/>
-      <w:pgMar w:top="1440" w:right="1440" w:bottom="1440" w:left="1440" w:header="720" w:footer="720" w:gutter="0"/>
+      <w:pgMar w:top="720" w:right="720" w:bottom="720" w:left="720" w:header="720" w:footer="720" w:gutter="0"/>
       <w:cols w:space="720"/>
       <w:docGrid w:linePitch="360"/>
     </w:sectPr>
@@ -724,6 +1715,7 @@
   <w:style w:type="paragraph" w:default="1" w:styleId="Normal">
     <w:name w:val="Normal"/>
     <w:qFormat/>
+    <w:rsid w:val="00A426F5"/>
     <w:pPr>
       <w:spacing w:line="279" w:lineRule="auto"/>
     </w:pPr>
@@ -754,7 +1746,6 @@
     <w:next w:val="Normal"/>
     <w:link w:val="Heading2Char"/>
     <w:uiPriority w:val="9"/>
-    <w:semiHidden/>
     <w:unhideWhenUsed/>
     <w:qFormat/>
     <w:rsid w:val="00814985"/>
@@ -971,7 +1962,6 @@
     <w:basedOn w:val="DefaultParagraphFont"/>
     <w:link w:val="Heading2"/>
     <w:uiPriority w:val="9"/>
-    <w:semiHidden/>
     <w:rsid w:val="00814985"/>
     <w:rPr>
       <w:rFonts w:asciiTheme="majorHAnsi" w:eastAsiaTheme="majorEastAsia" w:hAnsiTheme="majorHAnsi" w:cstheme="majorBidi"/>
@@ -1252,6 +2242,25 @@
     <w:rsid w:val="002512EE"/>
     <w:rPr>
       <w:color w:val="666666"/>
+    </w:rPr>
+  </w:style>
+  <w:style w:type="paragraph" w:styleId="Caption">
+    <w:name w:val="caption"/>
+    <w:basedOn w:val="Normal"/>
+    <w:next w:val="Normal"/>
+    <w:uiPriority w:val="35"/>
+    <w:unhideWhenUsed/>
+    <w:qFormat/>
+    <w:rsid w:val="000D357D"/>
+    <w:pPr>
+      <w:spacing w:before="0" w:after="200" w:line="240" w:lineRule="auto"/>
+    </w:pPr>
+    <w:rPr>
+      <w:i/>
+      <w:iCs/>
+      <w:color w:val="0E2841" w:themeColor="text2"/>
+      <w:sz w:val="18"/>
+      <w:szCs w:val="18"/>
     </w:rPr>
   </w:style>
 </w:styles>

</xml_diff>

<commit_message>
updated lab 1 logbook
</commit_message>
<xml_diff>
--- a/labs/lab1/lab1.docx
+++ b/labs/lab1/lab1.docx
@@ -250,7 +250,7 @@
                     <w:docPart w:val="3A950491F1364AA5B672ADAC0CCB1EA3"/>
                   </w:placeholder>
                   <w:dataBinding w:prefixMappings="xmlns:ns0='http://schemas.microsoft.com/office/2006/coverPageProps'" w:xpath="/ns0:CoverPageProperties[1]/ns0:PublishDate[1]" w:storeItemID="{55AF091B-3C7A-41E3-B477-F2FDAA23CFDA}"/>
-                  <w:date w:fullDate="2024-03-07T00:00:00Z">
+                  <w:date w:fullDate="2024-07-03T00:00:00Z">
                     <w:dateFormat w:val="M-d-yyyy"/>
                     <w:lid w:val="en-US"/>
                     <w:storeMappedDataAs w:val="dateTime"/>
@@ -273,7 +273,7 @@
                         <w:sz w:val="28"/>
                         <w:szCs w:val="28"/>
                       </w:rPr>
-                      <w:t>3-7-2024</w:t>
+                      <w:t>7-3-2024</w:t>
                     </w:r>
                   </w:p>
                 </w:sdtContent>
@@ -361,7 +361,7 @@
           <w:r>
             <w:fldChar w:fldCharType="separate"/>
           </w:r>
-          <w:hyperlink w:anchor="_Toc160726243" w:history="1">
+          <w:hyperlink w:anchor="_Toc161423753" w:history="1">
             <w:r>
               <w:rPr>
                 <w:rStyle w:val="Hyperlink"/>
@@ -388,7 +388,7 @@
                 <w:noProof/>
                 <w:webHidden/>
               </w:rPr>
-              <w:instrText xml:space="preserve"> PAGEREF _Toc160726243 \h </w:instrText>
+              <w:instrText xml:space="preserve"> PAGEREF _Toc161423753 \h </w:instrText>
             </w:r>
             <w:r>
               <w:rPr>
@@ -435,7 +435,7 @@
               <w14:ligatures w14:val="standardContextual"/>
             </w:rPr>
           </w:pPr>
-          <w:hyperlink w:anchor="_Toc160726244" w:history="1">
+          <w:hyperlink w:anchor="_Toc161423754" w:history="1">
             <w:r>
               <w:rPr>
                 <w:rStyle w:val="Hyperlink"/>
@@ -462,7 +462,7 @@
                 <w:noProof/>
                 <w:webHidden/>
               </w:rPr>
-              <w:instrText xml:space="preserve"> PAGEREF _Toc160726244 \h </w:instrText>
+              <w:instrText xml:space="preserve"> PAGEREF _Toc161423754 \h </w:instrText>
             </w:r>
             <w:r>
               <w:rPr>
@@ -509,7 +509,7 @@
               <w14:ligatures w14:val="standardContextual"/>
             </w:rPr>
           </w:pPr>
-          <w:hyperlink w:anchor="_Toc160726245" w:history="1">
+          <w:hyperlink w:anchor="_Toc161423755" w:history="1">
             <w:r>
               <w:rPr>
                 <w:rStyle w:val="Hyperlink"/>
@@ -536,7 +536,7 @@
                 <w:noProof/>
                 <w:webHidden/>
               </w:rPr>
-              <w:instrText xml:space="preserve"> PAGEREF _Toc160726245 \h </w:instrText>
+              <w:instrText xml:space="preserve"> PAGEREF _Toc161423755 \h </w:instrText>
             </w:r>
             <w:r>
               <w:rPr>
@@ -583,7 +583,7 @@
               <w14:ligatures w14:val="standardContextual"/>
             </w:rPr>
           </w:pPr>
-          <w:hyperlink w:anchor="_Toc160726246" w:history="1">
+          <w:hyperlink w:anchor="_Toc161423756" w:history="1">
             <w:r>
               <w:rPr>
                 <w:rStyle w:val="Hyperlink"/>
@@ -610,7 +610,7 @@
                 <w:noProof/>
                 <w:webHidden/>
               </w:rPr>
-              <w:instrText xml:space="preserve"> PAGEREF _Toc160726246 \h </w:instrText>
+              <w:instrText xml:space="preserve"> PAGEREF _Toc161423756 \h </w:instrText>
             </w:r>
             <w:r>
               <w:rPr>
@@ -657,7 +657,7 @@
               <w14:ligatures w14:val="standardContextual"/>
             </w:rPr>
           </w:pPr>
-          <w:hyperlink w:anchor="_Toc160726247" w:history="1">
+          <w:hyperlink w:anchor="_Toc161423757" w:history="1">
             <w:r>
               <w:rPr>
                 <w:rStyle w:val="Hyperlink"/>
@@ -684,7 +684,7 @@
                 <w:noProof/>
                 <w:webHidden/>
               </w:rPr>
-              <w:instrText xml:space="preserve"> PAGEREF _Toc160726247 \h </w:instrText>
+              <w:instrText xml:space="preserve"> PAGEREF _Toc161423757 \h </w:instrText>
             </w:r>
             <w:r>
               <w:rPr>
@@ -731,7 +731,7 @@
               <w14:ligatures w14:val="standardContextual"/>
             </w:rPr>
           </w:pPr>
-          <w:hyperlink w:anchor="_Toc160726248" w:history="1">
+          <w:hyperlink w:anchor="_Toc161423758" w:history="1">
             <w:r>
               <w:rPr>
                 <w:rStyle w:val="Hyperlink"/>
@@ -758,7 +758,7 @@
                 <w:noProof/>
                 <w:webHidden/>
               </w:rPr>
-              <w:instrText xml:space="preserve"> PAGEREF _Toc160726248 \h </w:instrText>
+              <w:instrText xml:space="preserve"> PAGEREF _Toc161423758 \h </w:instrText>
             </w:r>
             <w:r>
               <w:rPr>
@@ -805,7 +805,7 @@
               <w14:ligatures w14:val="standardContextual"/>
             </w:rPr>
           </w:pPr>
-          <w:hyperlink w:anchor="_Toc160726249" w:history="1">
+          <w:hyperlink w:anchor="_Toc161423759" w:history="1">
             <w:r>
               <w:rPr>
                 <w:rStyle w:val="Hyperlink"/>
@@ -832,7 +832,7 @@
                 <w:noProof/>
                 <w:webHidden/>
               </w:rPr>
-              <w:instrText xml:space="preserve"> PAGEREF _Toc160726249 \h </w:instrText>
+              <w:instrText xml:space="preserve"> PAGEREF _Toc161423759 \h </w:instrText>
             </w:r>
             <w:r>
               <w:rPr>
@@ -879,7 +879,7 @@
               <w14:ligatures w14:val="standardContextual"/>
             </w:rPr>
           </w:pPr>
-          <w:hyperlink w:anchor="_Toc160726250" w:history="1">
+          <w:hyperlink w:anchor="_Toc161423760" w:history="1">
             <w:r>
               <w:rPr>
                 <w:rStyle w:val="Hyperlink"/>
@@ -906,7 +906,7 @@
                 <w:noProof/>
                 <w:webHidden/>
               </w:rPr>
-              <w:instrText xml:space="preserve"> PAGEREF _Toc160726250 \h </w:instrText>
+              <w:instrText xml:space="preserve"> PAGEREF _Toc161423760 \h </w:instrText>
             </w:r>
             <w:r>
               <w:rPr>
@@ -953,7 +953,7 @@
               <w14:ligatures w14:val="standardContextual"/>
             </w:rPr>
           </w:pPr>
-          <w:hyperlink w:anchor="_Toc160726251" w:history="1">
+          <w:hyperlink w:anchor="_Toc161423761" w:history="1">
             <w:r>
               <w:rPr>
                 <w:rStyle w:val="Hyperlink"/>
@@ -980,7 +980,7 @@
                 <w:noProof/>
                 <w:webHidden/>
               </w:rPr>
-              <w:instrText xml:space="preserve"> PAGEREF _Toc160726251 \h </w:instrText>
+              <w:instrText xml:space="preserve"> PAGEREF _Toc161423761 \h </w:instrText>
             </w:r>
             <w:r>
               <w:rPr>
@@ -1027,7 +1027,7 @@
               <w14:ligatures w14:val="standardContextual"/>
             </w:rPr>
           </w:pPr>
-          <w:hyperlink w:anchor="_Toc160726252" w:history="1">
+          <w:hyperlink w:anchor="_Toc161423762" w:history="1">
             <w:r>
               <w:rPr>
                 <w:rStyle w:val="Hyperlink"/>
@@ -1054,7 +1054,7 @@
                 <w:noProof/>
                 <w:webHidden/>
               </w:rPr>
-              <w:instrText xml:space="preserve"> PAGEREF _Toc160726252 \h </w:instrText>
+              <w:instrText xml:space="preserve"> PAGEREF _Toc161423762 \h </w:instrText>
             </w:r>
             <w:r>
               <w:rPr>
@@ -1101,7 +1101,7 @@
               <w14:ligatures w14:val="standardContextual"/>
             </w:rPr>
           </w:pPr>
-          <w:hyperlink w:anchor="_Toc160726253" w:history="1">
+          <w:hyperlink w:anchor="_Toc161423763" w:history="1">
             <w:r>
               <w:rPr>
                 <w:rStyle w:val="Hyperlink"/>
@@ -1128,7 +1128,7 @@
                 <w:noProof/>
                 <w:webHidden/>
               </w:rPr>
-              <w:instrText xml:space="preserve"> PAGEREF _Toc160726253 \h </w:instrText>
+              <w:instrText xml:space="preserve"> PAGEREF _Toc161423763 \h </w:instrText>
             </w:r>
             <w:r>
               <w:rPr>
@@ -1175,7 +1175,7 @@
               <w14:ligatures w14:val="standardContextual"/>
             </w:rPr>
           </w:pPr>
-          <w:hyperlink w:anchor="_Toc160726254" w:history="1">
+          <w:hyperlink w:anchor="_Toc161423764" w:history="1">
             <w:r>
               <w:rPr>
                 <w:rStyle w:val="Hyperlink"/>
@@ -1202,7 +1202,7 @@
                 <w:noProof/>
                 <w:webHidden/>
               </w:rPr>
-              <w:instrText xml:space="preserve"> PAGEREF _Toc160726254 \h </w:instrText>
+              <w:instrText xml:space="preserve"> PAGEREF _Toc161423764 \h </w:instrText>
             </w:r>
             <w:r>
               <w:rPr>
@@ -1249,7 +1249,7 @@
               <w14:ligatures w14:val="standardContextual"/>
             </w:rPr>
           </w:pPr>
-          <w:hyperlink w:anchor="_Toc160726255" w:history="1">
+          <w:hyperlink w:anchor="_Toc161423765" w:history="1">
             <w:r>
               <w:rPr>
                 <w:rStyle w:val="Hyperlink"/>
@@ -1276,7 +1276,7 @@
                 <w:noProof/>
                 <w:webHidden/>
               </w:rPr>
-              <w:instrText xml:space="preserve"> PAGEREF _Toc160726255 \h </w:instrText>
+              <w:instrText xml:space="preserve"> PAGEREF _Toc161423765 \h </w:instrText>
             </w:r>
             <w:r>
               <w:rPr>
@@ -1323,7 +1323,7 @@
               <w14:ligatures w14:val="standardContextual"/>
             </w:rPr>
           </w:pPr>
-          <w:hyperlink w:anchor="_Toc160726256" w:history="1">
+          <w:hyperlink w:anchor="_Toc161423766" w:history="1">
             <w:r>
               <w:rPr>
                 <w:rStyle w:val="Hyperlink"/>
@@ -1350,7 +1350,7 @@
                 <w:noProof/>
                 <w:webHidden/>
               </w:rPr>
-              <w:instrText xml:space="preserve"> PAGEREF _Toc160726256 \h </w:instrText>
+              <w:instrText xml:space="preserve"> PAGEREF _Toc161423766 \h </w:instrText>
             </w:r>
             <w:r>
               <w:rPr>
@@ -1397,7 +1397,7 @@
               <w14:ligatures w14:val="standardContextual"/>
             </w:rPr>
           </w:pPr>
-          <w:hyperlink w:anchor="_Toc160726257" w:history="1">
+          <w:hyperlink w:anchor="_Toc161423767" w:history="1">
             <w:r>
               <w:rPr>
                 <w:rStyle w:val="Hyperlink"/>
@@ -1424,7 +1424,7 @@
                 <w:noProof/>
                 <w:webHidden/>
               </w:rPr>
-              <w:instrText xml:space="preserve"> PAGEREF _Toc160726257 \h </w:instrText>
+              <w:instrText xml:space="preserve"> PAGEREF _Toc161423767 \h </w:instrText>
             </w:r>
             <w:r>
               <w:rPr>
@@ -1471,7 +1471,7 @@
               <w14:ligatures w14:val="standardContextual"/>
             </w:rPr>
           </w:pPr>
-          <w:hyperlink w:anchor="_Toc160726258" w:history="1">
+          <w:hyperlink w:anchor="_Toc161423768" w:history="1">
             <w:r>
               <w:rPr>
                 <w:rStyle w:val="Hyperlink"/>
@@ -1498,7 +1498,7 @@
                 <w:noProof/>
                 <w:webHidden/>
               </w:rPr>
-              <w:instrText xml:space="preserve"> PAGEREF _Toc160726258 \h </w:instrText>
+              <w:instrText xml:space="preserve"> PAGEREF _Toc161423768 \h </w:instrText>
             </w:r>
             <w:r>
               <w:rPr>
@@ -1545,7 +1545,7 @@
               <w14:ligatures w14:val="standardContextual"/>
             </w:rPr>
           </w:pPr>
-          <w:hyperlink w:anchor="_Toc160726259" w:history="1">
+          <w:hyperlink w:anchor="_Toc161423769" w:history="1">
             <w:r>
               <w:rPr>
                 <w:rStyle w:val="Hyperlink"/>
@@ -1572,7 +1572,7 @@
                 <w:noProof/>
                 <w:webHidden/>
               </w:rPr>
-              <w:instrText xml:space="preserve"> PAGEREF _Toc160726259 \h </w:instrText>
+              <w:instrText xml:space="preserve"> PAGEREF _Toc161423769 \h </w:instrText>
             </w:r>
             <w:r>
               <w:rPr>
@@ -1619,7 +1619,7 @@
               <w14:ligatures w14:val="standardContextual"/>
             </w:rPr>
           </w:pPr>
-          <w:hyperlink w:anchor="_Toc160726260" w:history="1">
+          <w:hyperlink w:anchor="_Toc161423770" w:history="1">
             <w:r>
               <w:rPr>
                 <w:rStyle w:val="Hyperlink"/>
@@ -1646,7 +1646,7 @@
                 <w:noProof/>
                 <w:webHidden/>
               </w:rPr>
-              <w:instrText xml:space="preserve"> PAGEREF _Toc160726260 \h </w:instrText>
+              <w:instrText xml:space="preserve"> PAGEREF _Toc161423770 \h </w:instrText>
             </w:r>
             <w:r>
               <w:rPr>
@@ -1693,7 +1693,7 @@
               <w14:ligatures w14:val="standardContextual"/>
             </w:rPr>
           </w:pPr>
-          <w:hyperlink w:anchor="_Toc160726261" w:history="1">
+          <w:hyperlink w:anchor="_Toc161423771" w:history="1">
             <w:r>
               <w:rPr>
                 <w:rStyle w:val="Hyperlink"/>
@@ -1720,7 +1720,7 @@
                 <w:noProof/>
                 <w:webHidden/>
               </w:rPr>
-              <w:instrText xml:space="preserve"> PAGEREF _Toc160726261 \h </w:instrText>
+              <w:instrText xml:space="preserve"> PAGEREF _Toc161423771 \h </w:instrText>
             </w:r>
             <w:r>
               <w:rPr>
@@ -1767,7 +1767,7 @@
               <w14:ligatures w14:val="standardContextual"/>
             </w:rPr>
           </w:pPr>
-          <w:hyperlink w:anchor="_Toc160726262" w:history="1">
+          <w:hyperlink w:anchor="_Toc161423772" w:history="1">
             <w:r>
               <w:rPr>
                 <w:rStyle w:val="Hyperlink"/>
@@ -1794,7 +1794,7 @@
                 <w:noProof/>
                 <w:webHidden/>
               </w:rPr>
-              <w:instrText xml:space="preserve"> PAGEREF _Toc160726262 \h </w:instrText>
+              <w:instrText xml:space="preserve"> PAGEREF _Toc161423772 \h </w:instrText>
             </w:r>
             <w:r>
               <w:rPr>
@@ -1841,7 +1841,7 @@
               <w14:ligatures w14:val="standardContextual"/>
             </w:rPr>
           </w:pPr>
-          <w:hyperlink w:anchor="_Toc160726263" w:history="1">
+          <w:hyperlink w:anchor="_Toc161423773" w:history="1">
             <w:r>
               <w:rPr>
                 <w:rStyle w:val="Hyperlink"/>
@@ -1868,7 +1868,7 @@
                 <w:noProof/>
                 <w:webHidden/>
               </w:rPr>
-              <w:instrText xml:space="preserve"> PAGEREF _Toc160726263 \h </w:instrText>
+              <w:instrText xml:space="preserve"> PAGEREF _Toc161423773 \h </w:instrText>
             </w:r>
             <w:r>
               <w:rPr>
@@ -1915,7 +1915,7 @@
               <w14:ligatures w14:val="standardContextual"/>
             </w:rPr>
           </w:pPr>
-          <w:hyperlink w:anchor="_Toc160726264" w:history="1">
+          <w:hyperlink w:anchor="_Toc161423774" w:history="1">
             <w:r>
               <w:rPr>
                 <w:rStyle w:val="Hyperlink"/>
@@ -1942,7 +1942,7 @@
                 <w:noProof/>
                 <w:webHidden/>
               </w:rPr>
-              <w:instrText xml:space="preserve"> PAGEREF _Toc160726264 \h </w:instrText>
+              <w:instrText xml:space="preserve"> PAGEREF _Toc161423774 \h </w:instrText>
             </w:r>
             <w:r>
               <w:rPr>
@@ -1989,12 +1989,86 @@
               <w14:ligatures w14:val="standardContextual"/>
             </w:rPr>
           </w:pPr>
-          <w:hyperlink w:anchor="_Toc160726265" w:history="1">
+          <w:hyperlink w:anchor="_Toc161423775" w:history="1">
             <w:r>
               <w:rPr>
                 <w:rStyle w:val="Hyperlink"/>
                 <w:noProof/>
               </w:rPr>
+              <w:t>Reflection</w:t>
+            </w:r>
+            <w:r>
+              <w:rPr>
+                <w:noProof/>
+                <w:webHidden/>
+              </w:rPr>
+              <w:tab/>
+            </w:r>
+            <w:r>
+              <w:rPr>
+                <w:noProof/>
+                <w:webHidden/>
+              </w:rPr>
+              <w:fldChar w:fldCharType="begin"/>
+            </w:r>
+            <w:r>
+              <w:rPr>
+                <w:noProof/>
+                <w:webHidden/>
+              </w:rPr>
+              <w:instrText xml:space="preserve"> PAGEREF _Toc161423775 \h </w:instrText>
+            </w:r>
+            <w:r>
+              <w:rPr>
+                <w:noProof/>
+                <w:webHidden/>
+              </w:rPr>
+            </w:r>
+            <w:r>
+              <w:rPr>
+                <w:noProof/>
+                <w:webHidden/>
+              </w:rPr>
+              <w:fldChar w:fldCharType="separate"/>
+            </w:r>
+            <w:r>
+              <w:rPr>
+                <w:noProof/>
+                <w:webHidden/>
+              </w:rPr>
+              <w:t>11</w:t>
+            </w:r>
+            <w:r>
+              <w:rPr>
+                <w:noProof/>
+                <w:webHidden/>
+              </w:rPr>
+              <w:fldChar w:fldCharType="end"/>
+            </w:r>
+          </w:hyperlink>
+        </w:p>
+        <w:p>
+          <w:pPr>
+            <w:pStyle w:val="TOC1"/>
+            <w:tabs>
+              <w:tab w:val="right" w:leader="dot" w:pos="10790"/>
+            </w:tabs>
+            <w:rPr>
+              <w:rFonts w:eastAsiaTheme="minorEastAsia"/>
+              <w:noProof/>
+              <w:kern w:val="2"/>
+              <w:sz w:val="24"/>
+              <w:szCs w:val="24"/>
+              <w:lang w:val="en-GB" w:eastAsia="en-GB"/>
+              <w14:ligatures w14:val="standardContextual"/>
+            </w:rPr>
+          </w:pPr>
+          <w:hyperlink w:anchor="_Toc161423776" w:history="1">
+            <w:r>
+              <w:rPr>
+                <w:rStyle w:val="Hyperlink"/>
+                <w:noProof/>
+              </w:rPr>
               <w:t>Appendix</w:t>
             </w:r>
             <w:r>
@@ -2016,7 +2090,7 @@
                 <w:noProof/>
                 <w:webHidden/>
               </w:rPr>
-              <w:instrText xml:space="preserve"> PAGEREF _Toc160726265 \h </w:instrText>
+              <w:instrText xml:space="preserve"> PAGEREF _Toc161423776 \h </w:instrText>
             </w:r>
             <w:r>
               <w:rPr>
@@ -2036,7 +2110,7 @@
                 <w:noProof/>
                 <w:webHidden/>
               </w:rPr>
-              <w:t>11</w:t>
+              <w:t>12</w:t>
             </w:r>
             <w:r>
               <w:rPr>
@@ -2063,7 +2137,7 @@
               <w14:ligatures w14:val="standardContextual"/>
             </w:rPr>
           </w:pPr>
-          <w:hyperlink w:anchor="_Toc160726266" w:history="1">
+          <w:hyperlink w:anchor="_Toc161423777" w:history="1">
             <w:r>
               <w:rPr>
                 <w:rStyle w:val="Hyperlink"/>
@@ -2090,7 +2164,7 @@
                 <w:noProof/>
                 <w:webHidden/>
               </w:rPr>
-              <w:instrText xml:space="preserve"> PAGEREF _Toc160726266 \h </w:instrText>
+              <w:instrText xml:space="preserve"> PAGEREF _Toc161423777 \h </w:instrText>
             </w:r>
             <w:r>
               <w:rPr>
@@ -2110,7 +2184,7 @@
                 <w:noProof/>
                 <w:webHidden/>
               </w:rPr>
-              <w:t>11</w:t>
+              <w:t>12</w:t>
             </w:r>
             <w:r>
               <w:rPr>
@@ -2197,7 +2271,7 @@
       <w:pPr>
         <w:pStyle w:val="Heading1"/>
       </w:pPr>
-      <w:bookmarkStart w:id="0" w:name="_Toc160726243"/>
+      <w:bookmarkStart w:id="0" w:name="_Toc161423753"/>
       <w:r>
         <w:lastRenderedPageBreak/>
         <w:t>Task 1</w:t>
@@ -2208,7 +2282,7 @@
       <w:pPr>
         <w:pStyle w:val="Heading2"/>
       </w:pPr>
-      <w:bookmarkStart w:id="1" w:name="_Toc160726244"/>
+      <w:bookmarkStart w:id="1" w:name="_Toc161423754"/>
       <w:r>
         <w:t>Objectives</w:t>
       </w:r>
@@ -2351,7 +2425,7 @@
         <w:pStyle w:val="Heading2"/>
         <w:spacing w:before="240" w:line="278" w:lineRule="auto"/>
       </w:pPr>
-      <w:bookmarkStart w:id="2" w:name="_Toc160726245"/>
+      <w:bookmarkStart w:id="2" w:name="_Toc161423755"/>
       <w:r>
         <w:t>Calculations</w:t>
       </w:r>
@@ -2492,7 +2566,7 @@
           <w:rFonts w:eastAsiaTheme="minorEastAsia"/>
         </w:rPr>
       </w:pPr>
-      <w:bookmarkStart w:id="3" w:name="_Toc160726246"/>
+      <w:bookmarkStart w:id="3" w:name="_Toc161423756"/>
       <w:r>
         <w:rPr>
           <w:rFonts w:eastAsiaTheme="minorEastAsia"/>
@@ -2631,7 +2705,7 @@
           <w:rFonts w:eastAsiaTheme="minorEastAsia"/>
         </w:rPr>
       </w:pPr>
-      <w:bookmarkStart w:id="4" w:name="_Toc160726247"/>
+      <w:bookmarkStart w:id="4" w:name="_Toc161423757"/>
       <w:r>
         <w:rPr>
           <w:rFonts w:eastAsiaTheme="minorEastAsia"/>
@@ -2651,7 +2725,7 @@
       <w:pPr>
         <w:pStyle w:val="Heading3"/>
       </w:pPr>
-      <w:bookmarkStart w:id="5" w:name="_Toc160726248"/>
+      <w:bookmarkStart w:id="5" w:name="_Toc161423758"/>
       <w:r>
         <w:t>Equipment Used</w:t>
       </w:r>
@@ -2740,7 +2814,7 @@
         <w:pStyle w:val="Heading3"/>
         <w:spacing w:before="240" w:line="278" w:lineRule="auto"/>
       </w:pPr>
-      <w:bookmarkStart w:id="6" w:name="_Toc160726249"/>
+      <w:bookmarkStart w:id="6" w:name="_Toc161423759"/>
       <w:r>
         <w:t>Circuit Diagram</w:t>
       </w:r>
@@ -2832,8 +2906,13 @@
         <w:t>1.1</w:t>
       </w:r>
       <w:r>
-        <w:t xml:space="preserve"> circuit diagram</w:t>
-      </w:r>
+        <w:t xml:space="preserve"> circuit </w:t>
+      </w:r>
+      <w:proofErr w:type="gramStart"/>
+      <w:r>
+        <w:t>diagram</w:t>
+      </w:r>
+      <w:proofErr w:type="gramEnd"/>
     </w:p>
     <w:p>
       <w:pPr>
@@ -2857,7 +2936,7 @@
       <w:pPr>
         <w:pStyle w:val="Heading3"/>
       </w:pPr>
-      <w:bookmarkStart w:id="7" w:name="_Toc160726250"/>
+      <w:bookmarkStart w:id="7" w:name="_Toc161423760"/>
       <w:r>
         <w:lastRenderedPageBreak/>
         <w:t>Program Logic</w:t>
@@ -2950,8 +3029,13 @@
         <w:t>1.1</w:t>
       </w:r>
       <w:r>
-        <w:t xml:space="preserve"> flow chart</w:t>
-      </w:r>
+        <w:t xml:space="preserve"> flow </w:t>
+      </w:r>
+      <w:proofErr w:type="gramStart"/>
+      <w:r>
+        <w:t>chart</w:t>
+      </w:r>
+      <w:proofErr w:type="gramEnd"/>
     </w:p>
     <w:p>
       <w:pPr>
@@ -2959,7 +3043,7 @@
         <w:spacing w:before="240" w:line="278" w:lineRule="auto"/>
       </w:pPr>
       <w:bookmarkStart w:id="8" w:name="_Code_Snippet"/>
-      <w:bookmarkStart w:id="9" w:name="_Toc160726251"/>
+      <w:bookmarkStart w:id="9" w:name="_Toc161423761"/>
       <w:bookmarkEnd w:id="8"/>
       <w:r>
         <w:t>Code Snippet</w:t>
@@ -2996,7 +3080,7 @@
           <v:shape id="_x0000_i1025" type="#_x0000_t75" style="width:468pt;height:285.75pt" o:ole="">
             <v:imagedata r:id="rId12" o:title=""/>
           </v:shape>
-          <o:OLEObject Type="Embed" ProgID="Word.OpenDocumentText.12" ShapeID="_x0000_i1025" DrawAspect="Content" ObjectID="_1771356831" r:id="rId13"/>
+          <o:OLEObject Type="Embed" ProgID="Word.OpenDocumentText.12" ShapeID="_x0000_i1025" DrawAspect="Content" ObjectID="_1772036636" r:id="rId13"/>
         </w:object>
       </w:r>
     </w:p>
@@ -3004,7 +3088,7 @@
       <w:pPr>
         <w:pStyle w:val="Heading3"/>
       </w:pPr>
-      <w:bookmarkStart w:id="11" w:name="_Toc160726252"/>
+      <w:bookmarkStart w:id="11" w:name="_Toc161423762"/>
       <w:r>
         <w:lastRenderedPageBreak/>
         <w:t>Procedure &amp; Meth</w:t>
@@ -3215,7 +3299,7 @@
           <v:shape id="_x0000_i1026" type="#_x0000_t75" style="width:468pt;height:28.5pt" o:ole="">
             <v:imagedata r:id="rId14" o:title=""/>
           </v:shape>
-          <o:OLEObject Type="Embed" ProgID="Word.OpenDocumentText.12" ShapeID="_x0000_i1026" DrawAspect="Content" ObjectID="_1771356832" r:id="rId15"/>
+          <o:OLEObject Type="Embed" ProgID="Word.OpenDocumentText.12" ShapeID="_x0000_i1026" DrawAspect="Content" ObjectID="_1772036637" r:id="rId15"/>
         </w:object>
       </w:r>
     </w:p>
@@ -3246,7 +3330,7 @@
           <v:shape id="_x0000_i1027" type="#_x0000_t75" style="width:468pt;height:114pt" o:ole="">
             <v:imagedata r:id="rId16" o:title=""/>
           </v:shape>
-          <o:OLEObject Type="Embed" ProgID="Word.OpenDocumentText.12" ShapeID="_x0000_i1027" DrawAspect="Content" ObjectID="_1771356833" r:id="rId17"/>
+          <o:OLEObject Type="Embed" ProgID="Word.OpenDocumentText.12" ShapeID="_x0000_i1027" DrawAspect="Content" ObjectID="_1772036638" r:id="rId17"/>
         </w:object>
       </w:r>
     </w:p>
@@ -3281,7 +3365,7 @@
       <w:r>
         <w:br w:type="page"/>
       </w:r>
-      <w:bookmarkStart w:id="14" w:name="_Toc160726253"/>
+      <w:bookmarkStart w:id="14" w:name="_Toc161423763"/>
       <w:r>
         <w:lastRenderedPageBreak/>
         <w:t xml:space="preserve">Task </w:t>
@@ -3295,7 +3379,7 @@
       <w:pPr>
         <w:pStyle w:val="Heading3"/>
       </w:pPr>
-      <w:bookmarkStart w:id="15" w:name="_Toc160726254"/>
+      <w:bookmarkStart w:id="15" w:name="_Toc161423764"/>
       <w:r>
         <w:t>Equipment Used</w:t>
       </w:r>
@@ -3373,7 +3457,7 @@
         <w:pStyle w:val="Heading3"/>
         <w:spacing w:before="240" w:line="278" w:lineRule="auto"/>
       </w:pPr>
-      <w:bookmarkStart w:id="16" w:name="_Toc160726255"/>
+      <w:bookmarkStart w:id="16" w:name="_Toc161423765"/>
       <w:r>
         <w:t>Circuit Diagram</w:t>
       </w:r>
@@ -3465,11 +3549,16 @@
         <w:t>1.2</w:t>
       </w:r>
       <w:r>
-        <w:t xml:space="preserve"> circuit diagra</w:t>
+        <w:t xml:space="preserve"> circuit </w:t>
+      </w:r>
+      <w:proofErr w:type="gramStart"/>
+      <w:r>
+        <w:t>diagra</w:t>
       </w:r>
       <w:r>
         <w:t>m</w:t>
       </w:r>
+      <w:proofErr w:type="gramEnd"/>
     </w:p>
     <w:p>
       <w:pPr>
@@ -3481,7 +3570,7 @@
       <w:pPr>
         <w:pStyle w:val="Heading3"/>
       </w:pPr>
-      <w:bookmarkStart w:id="17" w:name="_Toc160726256"/>
+      <w:bookmarkStart w:id="17" w:name="_Toc161423766"/>
       <w:r>
         <w:lastRenderedPageBreak/>
         <w:t>Program Logic</w:t>
@@ -3574,14 +3663,19 @@
         <w:t>1.2</w:t>
       </w:r>
       <w:r>
-        <w:t xml:space="preserve"> flow chart</w:t>
-      </w:r>
+        <w:t xml:space="preserve"> flow </w:t>
+      </w:r>
+      <w:proofErr w:type="gramStart"/>
+      <w:r>
+        <w:t>chart</w:t>
+      </w:r>
+      <w:proofErr w:type="gramEnd"/>
     </w:p>
     <w:p>
       <w:pPr>
         <w:pStyle w:val="Heading3"/>
       </w:pPr>
-      <w:bookmarkStart w:id="18" w:name="_Toc160726257"/>
+      <w:bookmarkStart w:id="18" w:name="_Toc161423767"/>
       <w:r>
         <w:lastRenderedPageBreak/>
         <w:t>Code Snippet</w:t>
@@ -3600,7 +3694,7 @@
           <v:shape id="_x0000_i1028" type="#_x0000_t75" style="width:468pt;height:285pt" o:ole="">
             <v:imagedata r:id="rId20" o:title=""/>
           </v:shape>
-          <o:OLEObject Type="Embed" ProgID="Word.OpenDocumentText.12" ShapeID="_x0000_i1028" DrawAspect="Content" ObjectID="_1771356834" r:id="rId21"/>
+          <o:OLEObject Type="Embed" ProgID="Word.OpenDocumentText.12" ShapeID="_x0000_i1028" DrawAspect="Content" ObjectID="_1772036639" r:id="rId21"/>
         </w:object>
       </w:r>
     </w:p>
@@ -3609,7 +3703,7 @@
         <w:pStyle w:val="Heading3"/>
       </w:pPr>
       <w:bookmarkStart w:id="20" w:name="_Procedure_&amp;_Methodology"/>
-      <w:bookmarkStart w:id="21" w:name="_Toc160726258"/>
+      <w:bookmarkStart w:id="21" w:name="_Toc161423768"/>
       <w:bookmarkEnd w:id="20"/>
       <w:r>
         <w:t>Procedure &amp; Methodology</w:t>
@@ -3720,7 +3814,23 @@
         <w:t>to</w:t>
       </w:r>
       <w:r>
-        <w:t xml:space="preserve"> 23 belongs to A region (Port A) and since we need to send output signals we set Data Direction Register of A (DDRA) to 0xFF which is equivalent highest 8-bit byte value in hex</w:t>
+        <w:t xml:space="preserve"> 23 </w:t>
+      </w:r>
+      <w:proofErr w:type="gramStart"/>
+      <w:r>
+        <w:t>belongs</w:t>
+      </w:r>
+      <w:proofErr w:type="gramEnd"/>
+      <w:r>
+        <w:t xml:space="preserve"> to A region (Port A) and since we need to send output </w:t>
+      </w:r>
+      <w:proofErr w:type="gramStart"/>
+      <w:r>
+        <w:t>signals</w:t>
+      </w:r>
+      <w:proofErr w:type="gramEnd"/>
+      <w:r>
+        <w:t xml:space="preserve"> we set Data Direction Register of A (DDRA) to 0xFF which is equivalent highest 8-bit byte value in hex</w:t>
       </w:r>
       <w:r>
         <w:t>.</w:t>
@@ -3779,7 +3889,7 @@
       <w:pPr>
         <w:pStyle w:val="Heading2"/>
       </w:pPr>
-      <w:bookmarkStart w:id="22" w:name="_Toc160726259"/>
+      <w:bookmarkStart w:id="22" w:name="_Toc161423769"/>
       <w:r>
         <w:lastRenderedPageBreak/>
         <w:t xml:space="preserve">Task </w:t>
@@ -3793,7 +3903,7 @@
       <w:pPr>
         <w:pStyle w:val="Heading3"/>
       </w:pPr>
-      <w:bookmarkStart w:id="23" w:name="_Toc160726260"/>
+      <w:bookmarkStart w:id="23" w:name="_Toc161423770"/>
       <w:r>
         <w:t>Equipment Used</w:t>
       </w:r>
@@ -3871,7 +3981,7 @@
         <w:pStyle w:val="Heading3"/>
         <w:spacing w:before="240" w:line="278" w:lineRule="auto"/>
       </w:pPr>
-      <w:bookmarkStart w:id="24" w:name="_Toc160726261"/>
+      <w:bookmarkStart w:id="24" w:name="_Toc161423771"/>
       <w:r>
         <w:t>Circuit Diagram</w:t>
       </w:r>
@@ -3966,8 +4076,13 @@
         <w:t>1.3</w:t>
       </w:r>
       <w:r>
-        <w:t xml:space="preserve"> circuit diagram</w:t>
-      </w:r>
+        <w:t xml:space="preserve"> circuit </w:t>
+      </w:r>
+      <w:proofErr w:type="gramStart"/>
+      <w:r>
+        <w:t>diagram</w:t>
+      </w:r>
+      <w:proofErr w:type="gramEnd"/>
     </w:p>
     <w:p>
       <w:pPr>
@@ -3978,7 +4093,7 @@
       <w:pPr>
         <w:pStyle w:val="Heading3"/>
       </w:pPr>
-      <w:bookmarkStart w:id="25" w:name="_Toc160726262"/>
+      <w:bookmarkStart w:id="25" w:name="_Toc161423772"/>
       <w:r>
         <w:t>Program Logic</w:t>
       </w:r>
@@ -4070,14 +4185,19 @@
         <w:t>1.3</w:t>
       </w:r>
       <w:r>
-        <w:t xml:space="preserve"> flow chart</w:t>
-      </w:r>
+        <w:t xml:space="preserve"> flow </w:t>
+      </w:r>
+      <w:proofErr w:type="gramStart"/>
+      <w:r>
+        <w:t>chart</w:t>
+      </w:r>
+      <w:proofErr w:type="gramEnd"/>
     </w:p>
     <w:p>
       <w:pPr>
         <w:pStyle w:val="Heading3"/>
       </w:pPr>
-      <w:bookmarkStart w:id="26" w:name="_Toc160726263"/>
+      <w:bookmarkStart w:id="26" w:name="_Toc161423773"/>
       <w:r>
         <w:lastRenderedPageBreak/>
         <w:t>Code Snippet</w:t>
@@ -4096,7 +4216,7 @@
           <v:shape id="_x0000_i1029" type="#_x0000_t75" style="width:468pt;height:285pt" o:ole="">
             <v:imagedata r:id="rId24" o:title=""/>
           </v:shape>
-          <o:OLEObject Type="Embed" ProgID="Word.OpenDocumentText.12" ShapeID="_x0000_i1029" DrawAspect="Content" ObjectID="_1771356835" r:id="rId25"/>
+          <o:OLEObject Type="Embed" ProgID="Word.OpenDocumentText.12" ShapeID="_x0000_i1029" DrawAspect="Content" ObjectID="_1772036640" r:id="rId25"/>
         </w:object>
       </w:r>
     </w:p>
@@ -4104,7 +4224,7 @@
       <w:pPr>
         <w:pStyle w:val="Heading3"/>
       </w:pPr>
-      <w:bookmarkStart w:id="28" w:name="_Toc160726264"/>
+      <w:bookmarkStart w:id="28" w:name="_Toc161423774"/>
       <w:r>
         <w:t>Procedure &amp; Methodology</w:t>
       </w:r>
@@ -4119,8 +4239,13 @@
         </w:numPr>
         <w:spacing w:before="0"/>
       </w:pPr>
-      <w:r>
-        <w:t xml:space="preserve">Similar to </w:t>
+      <w:proofErr w:type="gramStart"/>
+      <w:r>
+        <w:t>Similar to</w:t>
+      </w:r>
+      <w:proofErr w:type="gramEnd"/>
+      <w:r>
+        <w:t xml:space="preserve"> </w:t>
       </w:r>
       <w:hyperlink w:anchor="_Procedure_&amp;_Methodology" w:history="1">
         <w:r>
@@ -4187,7 +4312,15 @@
         <w:t>7</w:t>
       </w:r>
       <w:r>
-        <w:t xml:space="preserve"> belongs to </w:t>
+        <w:t xml:space="preserve"> </w:t>
+      </w:r>
+      <w:proofErr w:type="gramStart"/>
+      <w:r>
+        <w:t>belongs</w:t>
+      </w:r>
+      <w:proofErr w:type="gramEnd"/>
+      <w:r>
+        <w:t xml:space="preserve"> to </w:t>
       </w:r>
       <w:r>
         <w:t>C</w:t>
@@ -4285,12 +4418,58 @@
       <w:pPr>
         <w:pStyle w:val="Heading1"/>
       </w:pPr>
-      <w:bookmarkStart w:id="29" w:name="_Toc160726265"/>
+      <w:bookmarkStart w:id="29" w:name="_Toc161423775"/>
+      <w:r>
+        <w:lastRenderedPageBreak/>
+        <w:t>Reflection</w:t>
+      </w:r>
+      <w:bookmarkEnd w:id="29"/>
+    </w:p>
+    <w:p>
+      <w:pPr>
+        <w:spacing w:line="278" w:lineRule="auto"/>
+      </w:pPr>
+      <w:r>
+        <w:t>In this lab, we learned how to effectively utilize AVR libraries and manipulate PORT regions to control inputs and outputs on an AVR microcontroller. One of the main things we grasped was configuring DDR settings to define whether pins act as inputs or outputs.</w:t>
+      </w:r>
+    </w:p>
+    <w:p>
+      <w:pPr>
+        <w:spacing w:line="278" w:lineRule="auto"/>
+      </w:pPr>
+      <w:r>
+        <w:t>By making use of AVR libraries, we simplified our code and gained access to useful functions, boosting our efficiency. This allowed us to achieve our project goals more smoothly and efficiently.</w:t>
+      </w:r>
+    </w:p>
+    <w:p>
+      <w:pPr>
+        <w:spacing w:line="278" w:lineRule="auto"/>
+      </w:pPr>
+      <w:r>
+        <w:t>Additionally, we honed our skills in bit manipulation and logical operations, which helped us control outputs in specific patterns as needed for our project. This hands-on experience enhanced our understanding of low-level hardware interactions.</w:t>
+      </w:r>
+    </w:p>
+    <w:p>
+      <w:pPr>
+        <w:spacing w:line="278" w:lineRule="auto"/>
+      </w:pPr>
+      <w:r>
+        <w:t>Overall, this lab provided valuable insights into AVR programming, equipping us with practical skills and confidence to tackle future projects with AVR microcontrollers.</w:t>
+      </w:r>
+      <w:r>
+        <w:br w:type="page"/>
+      </w:r>
+    </w:p>
+    <w:p>
+      <w:pPr>
+        <w:pStyle w:val="Heading1"/>
+      </w:pPr>
+      <w:bookmarkStart w:id="30" w:name="_Toc161423776"/>
       <w:r>
         <w:lastRenderedPageBreak/>
         <w:t>Appendix</w:t>
       </w:r>
-      <w:bookmarkEnd w:id="29"/>
+      <w:bookmarkEnd w:id="30"/>
     </w:p>
     <w:p>
       <w:pPr>
@@ -4298,14 +4477,14 @@
         <w:spacing w:before="0"/>
         <w:jc w:val="left"/>
       </w:pPr>
-      <w:bookmarkStart w:id="30" w:name="_Toc160726266"/>
+      <w:bookmarkStart w:id="31" w:name="_Toc161423777"/>
       <w:r>
         <w:t>Part 1</w:t>
       </w:r>
       <w:r>
         <w:t>: Images of physical circuit of Task 1.2</w:t>
       </w:r>
-      <w:bookmarkEnd w:id="30"/>
+      <w:bookmarkEnd w:id="31"/>
     </w:p>
     <w:p>
       <w:pPr>
@@ -7024,7 +7203,9 @@
     <w:rsid w:val="003F256B"/>
     <w:rsid w:val="00673646"/>
     <w:rsid w:val="008F3193"/>
+    <w:rsid w:val="00B42A26"/>
     <w:rsid w:val="00DB23DF"/>
+    <w:rsid w:val="00E5575B"/>
     <w:rsid w:val="00FA3AEC"/>
   </w:rsids>
   <m:mathPr>
@@ -7803,7 +7984,7 @@
 
 <file path=customXml/item1.xml><?xml version="1.0" encoding="utf-8"?>
 <CoverPageProperties xmlns="http://schemas.microsoft.com/office/2006/coverPageProps">
-  <PublishDate>2024-03-07T00:00:00</PublishDate>
+  <PublishDate>2024-07-03T00:00:00</PublishDate>
   <Abstract/>
   <CompanyAddress/>
   <CompanyPhone/>

</xml_diff>